<commit_message>
docs(audit): correct Places card system census
</commit_message>
<xml_diff>
--- a/docs/places-card-system-audit.docx
+++ b/docs/places-card-system-audit.docx
@@ -669,7 +669,7 @@
                 <w:color w:val="201A18"/>
                 <w:sz w:val="19"/>
               </w:rPr>
-              <w:t>Use one raised card for the current conviction or urgency. Make secondary notices quiet panels or rows. Repeating elevated containers makes every item feel equally important.</w:t>
+              <w:t>Treat zero raised cards as the normal page. The raised treatment is reserved for a conviction — exactly one place card the system can stand behind — and no producer emits one today, deliberately: the only place-bearing sections are a gap (whose producer declines to rank, by design), proximity (a confounded signal), and the user’s own saves. Urgency cannot take it either; notices are barred from the raised treatment by contract. So notices and prompts are quiet panels or rows, and the rule that carries the weight is the last one: repeating elevated containers makes every item feel equally important.</w:t>
             </w:r>
           </w:p>
         </w:tc>
@@ -1166,7 +1166,7 @@
           <w:color w:val="201A18"/>
           <w:sz w:val="20"/>
         </w:rPr>
-        <w:t>Keep the current conviction card raised; convert nearby secondary cards to quiet panels or list rows. This restores a visible difference between ‘act now’ and ‘browse.’</w:t>
+        <w:t>Convert secondary cards to quiet panels or list rows, and compose for a page with no raised card at all — the common case today. This restores a visible difference between ‘act now’ and ‘browse’ without depending on a conviction that has no honest producer yet.</w:t>
       </w:r>
     </w:p>
     <w:p>

</xml_diff>